<commit_message>
Add docx diff workflow
</commit_message>
<xml_diff>
--- a/test.docx
+++ b/test.docx
@@ -20,6 +20,13 @@
     <w:p>
       <w:r>
         <w:t>Added one more line</w:t>
+      </w:r>
+      <w:r>
+        <w:br/>
+      </w:r>
+      <w:r>
+        <w:br/>
+        <w:t>thi is a new line</w:t>
       </w:r>
     </w:p>
     <w:sectPr>

</xml_diff>

<commit_message>
Update docx for PR test
</commit_message>
<xml_diff>
--- a/test.docx
+++ b/test.docx
@@ -26,7 +26,23 @@
       </w:r>
       <w:r>
         <w:br/>
-        <w:t>thi is a new line</w:t>
+      </w:r>
+      <w:proofErr w:type="spellStart"/>
+      <w:r>
+        <w:t>thi</w:t>
+      </w:r>
+      <w:proofErr w:type="spellEnd"/>
+      <w:r>
+        <w:t xml:space="preserve"> is a new line</w:t>
+      </w:r>
+      <w:r>
+        <w:br/>
+      </w:r>
+      <w:r>
+        <w:br/>
+      </w:r>
+      <w:r>
+        <w:t>THIS IS A CHANGE FOR PR TEST</w:t>
       </w:r>
     </w:p>
     <w:sectPr>

</xml_diff>

<commit_message>
Second change for diff
</commit_message>
<xml_diff>
--- a/test.docx
+++ b/test.docx
@@ -43,6 +43,15 @@
       </w:r>
       <w:r>
         <w:t>THIS IS A CHANGE FOR PR TEST</w:t>
+      </w:r>
+      <w:r>
+        <w:br/>
+      </w:r>
+      <w:r>
+        <w:br/>
+      </w:r>
+      <w:r>
+        <w:t>THIS IS SECOND CHANGE FOR TEST</w:t>
       </w:r>
     </w:p>
     <w:sectPr>

</xml_diff>

<commit_message>
Trigger full diff view
</commit_message>
<xml_diff>
--- a/test.docx
+++ b/test.docx
@@ -26,14 +26,7 @@
       </w:r>
       <w:r>
         <w:br/>
-      </w:r>
-      <w:proofErr w:type="spellStart"/>
-      <w:r>
-        <w:t>thi</w:t>
-      </w:r>
-      <w:proofErr w:type="spellEnd"/>
-      <w:r>
-        <w:t xml:space="preserve"> is a new line</w:t>
+        <w:t>thi is a new line</w:t>
       </w:r>
       <w:r>
         <w:br/>
@@ -52,6 +45,18 @@
       </w:r>
       <w:r>
         <w:t>THIS IS SECOND CHANGE FOR TEST</w:t>
+      </w:r>
+      <w:r>
+        <w:br/>
+      </w:r>
+      <w:r>
+        <w:br/>
+      </w:r>
+      <w:r>
+        <w:t>FINAL TEST LINE FOR FULL VIEW</w:t>
+      </w:r>
+      <w:r>
+        <w:t xml:space="preserve"> polo</w:t>
       </w:r>
     </w:p>
     <w:sectPr>

</xml_diff>

<commit_message>
Updated document with readable diff
</commit_message>
<xml_diff>
--- a/test.docx
+++ b/test.docx
@@ -80,6 +80,13 @@
       <w:r>
         <w:br/>
         <w:t xml:space="preserve">hello Pratima </w:t>
+      </w:r>
+      <w:r>
+        <w:br/>
+      </w:r>
+      <w:r>
+        <w:br/>
+        <w:t>this is for testing on repo</w:t>
       </w:r>
     </w:p>
     <w:sectPr>

</xml_diff>

<commit_message>
Updated document with readable diff removal test
</commit_message>
<xml_diff>
--- a/test.docx
+++ b/test.docx
@@ -5,14 +5,6 @@
     <w:p>
       <w:r>
         <w:t>Hello Pratima</w:t>
-      </w:r>
-    </w:p>
-    <w:p>
-      <w:r>
-        <w:t xml:space="preserve">This is version </w:t>
-      </w:r>
-      <w:r>
-        <w:t>9</w:t>
       </w:r>
     </w:p>
     <w:p>

</xml_diff>

<commit_message>
Updated document with readable diff test format
</commit_message>
<xml_diff>
--- a/test.docx
+++ b/test.docx
@@ -3,84 +3,691 @@
 <w:document xmlns:wpc="http://schemas.microsoft.com/office/word/2010/wordprocessingCanvas" xmlns:cx="http://schemas.microsoft.com/office/drawing/2014/chartex" xmlns:cx1="http://schemas.microsoft.com/office/drawing/2015/9/8/chartex" xmlns:cx2="http://schemas.microsoft.com/office/drawing/2015/10/21/chartex" xmlns:cx3="http://schemas.microsoft.com/office/drawing/2016/5/9/chartex" xmlns:cx4="http://schemas.microsoft.com/office/drawing/2016/5/10/chartex" xmlns:cx5="http://schemas.microsoft.com/office/drawing/2016/5/11/chartex" xmlns:cx6="http://schemas.microsoft.com/office/drawing/2016/5/12/chartex" xmlns:cx7="http://schemas.microsoft.com/office/drawing/2016/5/13/chartex" xmlns:cx8="http://schemas.microsoft.com/office/drawing/2016/5/14/chartex" xmlns:mc="http://schemas.openxmlformats.org/markup-compatibility/2006" xmlns:aink="http://schemas.microsoft.com/office/drawing/2016/ink" xmlns:am3d="http://schemas.microsoft.com/office/drawing/2017/model3d" xmlns:o="urn:schemas-microsoft-com:office:office" xmlns:oel="http://schemas.microsoft.com/office/2019/extlst" xmlns:r="http://schemas.openxmlformats.org/officeDocument/2006/relationships" xmlns:m="http://schemas.openxmlformats.org/officeDocument/2006/math" xmlns:v="urn:schemas-microsoft-com:vml" xmlns:wp14="http://schemas.microsoft.com/office/word/2010/wordprocessingDrawing" xmlns:wp="http://schemas.openxmlformats.org/drawingml/2006/wordprocessingDrawing" xmlns:w10="urn:schemas-microsoft-com:office:word" xmlns:w="http://schemas.openxmlformats.org/wordprocessingml/2006/main" xmlns:w14="http://schemas.microsoft.com/office/word/2010/wordml" xmlns:w15="http://schemas.microsoft.com/office/word/2012/wordml" xmlns:w16cex="http://schemas.microsoft.com/office/word/2018/wordml/cex" xmlns:w16cid="http://schemas.microsoft.com/office/word/2016/wordml/cid" xmlns:w16="http://schemas.microsoft.com/office/word/2018/wordml" xmlns:w16du="http://schemas.microsoft.com/office/word/2023/wordml/word16du" xmlns:w16sdtdh="http://schemas.microsoft.com/office/word/2020/wordml/sdtdatahash" xmlns:w16sdtfl="http://schemas.microsoft.com/office/word/2024/wordml/sdtformatlock" xmlns:w16se="http://schemas.microsoft.com/office/word/2015/wordml/symex" xmlns:wpg="http://schemas.microsoft.com/office/word/2010/wordprocessingGroup" xmlns:wpi="http://schemas.microsoft.com/office/word/2010/wordprocessingInk" xmlns:wne="http://schemas.microsoft.com/office/word/2006/wordml" xmlns:wps="http://schemas.microsoft.com/office/word/2010/wordprocessingShape" mc:Ignorable="w14 w15 w16se w16cid w16 w16cex w16sdtdh w16sdtfl w16du wp14">
   <w:body>
     <w:p>
-      <w:r>
-        <w:t>Hello Pratima</w:t>
+      <w:pPr>
+        <w:spacing w:after="120"/>
+        <w:jc w:val="center"/>
+        <w:rPr>
+          <w:b/>
+          <w:sz w:val="28"/>
+          <w:szCs w:val="28"/>
+        </w:rPr>
+      </w:pPr>
+      <w:r>
+        <w:rPr>
+          <w:b/>
+          <w:bCs/>
+          <w:sz w:val="28"/>
+          <w:szCs w:val="28"/>
+        </w:rPr>
+        <w:t>{benchName}</w:t>
       </w:r>
     </w:p>
     <w:p>
-      <w:r>
-        <w:t>Testing docx diff feature</w:t>
+      <w:pPr>
+        <w:spacing w:after="120"/>
+        <w:jc w:val="center"/>
+        <w:rPr>
+          <w:b/>
+          <w:bCs/>
+          <w:sz w:val="28"/>
+          <w:szCs w:val="28"/>
+        </w:rPr>
+      </w:pPr>
+      <w:r>
+        <w:rPr>
+          <w:b/>
+          <w:bCs/>
+          <w:sz w:val="28"/>
+          <w:szCs w:val="28"/>
+        </w:rPr>
+        <w:t>{jurisdiction}</w:t>
       </w:r>
     </w:p>
     <w:p>
-      <w:r>
-        <w:t>Added one more line</w:t>
-      </w:r>
-      <w:r>
-        <w:br/>
-      </w:r>
-      <w:r>
-        <w:br/>
-        <w:t>thi</w:t>
-      </w:r>
-      <w:r>
-        <w:t xml:space="preserve">s </w:t>
-      </w:r>
-      <w:r>
-        <w:t xml:space="preserve"> is a new line</w:t>
-      </w:r>
-      <w:r>
-        <w:br/>
-      </w:r>
-      <w:r>
-        <w:br/>
-      </w:r>
-      <w:r>
-        <w:t>THIS IS A CHANGE FOR PR TEST</w:t>
-      </w:r>
-      <w:r>
-        <w:br/>
-      </w:r>
-      <w:r>
-        <w:br/>
-      </w:r>
-      <w:r>
-        <w:t>THIS IS SECOND CHANGE FOR TEST</w:t>
-      </w:r>
-      <w:r>
-        <w:br/>
-      </w:r>
-      <w:r>
-        <w:br/>
-      </w:r>
-      <w:r>
-        <w:t>FINAL TEST LINE FOR FULL VIEW</w:t>
-      </w:r>
-      <w:r>
-        <w:t xml:space="preserve"> polo</w:t>
-      </w:r>
-      <w:r>
-        <w:br/>
-      </w:r>
-      <w:r>
-        <w:br/>
-        <w:t>I am testing this again for the actual line changes</w:t>
-      </w:r>
-      <w:r>
-        <w:br/>
-      </w:r>
-      <w:r>
-        <w:br/>
-        <w:t xml:space="preserve">hello Pratima </w:t>
-      </w:r>
-      <w:r>
-        <w:br/>
-      </w:r>
-      <w:r>
-        <w:br/>
-        <w:t>this is for testing on repo</w:t>
+      <w:pPr>
+        <w:spacing w:after="120"/>
+        <w:jc w:val="center"/>
+        <w:rPr>
+          <w:b/>
+          <w:bCs/>
+          <w:sz w:val="28"/>
+          <w:szCs w:val="28"/>
+        </w:rPr>
+      </w:pPr>
+      <w:r>
+        <w:rPr>
+          <w:b/>
+          <w:bCs/>
+          <w:sz w:val="28"/>
+          <w:szCs w:val="28"/>
+        </w:rPr>
+        <w:t>{applicationType} NO. {applicationNum} OF {applicationYear}</w:t>
       </w:r>
     </w:p>
+    <w:p>
+      <w:pPr>
+        <w:spacing w:after="120"/>
+        <w:jc w:val="center"/>
+        <w:rPr>
+          <w:b/>
+          <w:sz w:val="28"/>
+          <w:szCs w:val="28"/>
+        </w:rPr>
+      </w:pPr>
+      <w:r>
+        <w:rPr>
+          <w:b/>
+          <w:bCs/>
+          <w:sz w:val="28"/>
+          <w:szCs w:val="28"/>
+        </w:rPr>
+        <w:t>IN</w:t>
+      </w:r>
+    </w:p>
+    <w:p>
+      <w:pPr>
+        <w:spacing w:after="120"/>
+        <w:jc w:val="center"/>
+        <w:rPr>
+          <w:b/>
+          <w:sz w:val="28"/>
+          <w:szCs w:val="28"/>
+        </w:rPr>
+      </w:pPr>
+      <w:r>
+        <w:rPr>
+          <w:b/>
+          <w:sz w:val="28"/>
+          <w:szCs w:val="28"/>
+        </w:rPr>
+        <w:t xml:space="preserve"> {caseType} NO. {petitionNumber} OF {yearOfPetition}</w:t>
+      </w:r>
+    </w:p>
+    <w:p>
+      <w:pPr>
+        <w:spacing w:after="120"/>
+        <w:jc w:val="center"/>
+        <w:rPr>
+          <w:b/>
+          <w:sz w:val="28"/>
+          <w:szCs w:val="28"/>
+        </w:rPr>
+      </w:pPr>
+    </w:p>
+    <w:p>
+      <w:pPr>
+        <w:outlineLvl w:val="0"/>
+        <w:rPr>
+          <w:b/>
+          <w:sz w:val="28"/>
+          <w:szCs w:val="28"/>
+        </w:rPr>
+      </w:pPr>
+      <w:r>
+        <w:rPr>
+          <w:b/>
+          <w:sz w:val="28"/>
+          <w:szCs w:val="28"/>
+          <w:u w:val="single"/>
+        </w:rPr>
+        <w:t>IN THE MATTER OF</w:t>
+      </w:r>
+      <w:r>
+        <w:rPr>
+          <w:b/>
+          <w:sz w:val="28"/>
+          <w:szCs w:val="28"/>
+        </w:rPr>
+        <w:t>:</w:t>
+      </w:r>
+    </w:p>
+    <w:p>
+      <w:pPr>
+        <w:outlineLvl w:val="0"/>
+        <w:rPr>
+          <w:b/>
+          <w:sz w:val="28"/>
+          <w:szCs w:val="28"/>
+        </w:rPr>
+      </w:pPr>
+    </w:p>
+    <w:tbl>
+      <w:tblPr>
+        <w:tblW w:w="8520" w:type="dxa"/>
+        <w:tblBorders>
+          <w:insideH w:val="nil"/>
+          <w:insideV w:val="nil"/>
+        </w:tblBorders>
+        <w:tblLayout w:type="fixed"/>
+        <w:tblCellMar>
+          <w:left w:w="0" w:type="dxa"/>
+        </w:tblCellMar>
+        <w:tblLook w:val="0400" w:firstRow="0" w:lastRow="0" w:firstColumn="0" w:lastColumn="0" w:noHBand="0" w:noVBand="1"/>
+      </w:tblPr>
+      <w:tblGrid>
+        <w:gridCol w:w="4616"/>
+        <w:gridCol w:w="3904"/>
+      </w:tblGrid>
+      <w:tr>
+        <w:tc>
+          <w:tcPr>
+            <w:tcW w:w="4616" w:type="dxa"/>
+            <w:tcBorders>
+              <w:top w:val="nil"/>
+              <w:left w:val="nil"/>
+              <w:bottom w:val="nil"/>
+              <w:right w:val="nil"/>
+            </w:tcBorders>
+            <w:hideMark/>
+          </w:tcPr>
+          <w:p>
+            <w:pPr>
+              <w:spacing w:line="360" w:lineRule="auto"/>
+              <w:rPr>
+                <w:rFonts w:eastAsia="Bookman Old Style"/>
+                <w:sz w:val="28"/>
+                <w:szCs w:val="28"/>
+              </w:rPr>
+            </w:pPr>
+            <w:r>
+              <w:rPr>
+                <w:rFonts w:eastAsia="Bookman Old Style"/>
+                <w:sz w:val="28"/>
+                <w:szCs w:val="28"/>
+              </w:rPr>
+              <w:t>{petitionerWS}</w:t>
+            </w:r>
+          </w:p>
+        </w:tc>
+        <w:tc>
+          <w:tcPr>
+            <w:tcW w:w="3904" w:type="dxa"/>
+            <w:tcBorders>
+              <w:top w:val="nil"/>
+              <w:left w:val="nil"/>
+              <w:bottom w:val="nil"/>
+              <w:right w:val="nil"/>
+            </w:tcBorders>
+            <w:hideMark/>
+          </w:tcPr>
+          <w:p>
+            <w:pPr>
+              <w:spacing w:line="360" w:lineRule="auto"/>
+              <w:ind w:right="-127"/>
+              <w:jc w:val="right"/>
+            </w:pPr>
+            <w:r>
+              <w:rPr>
+                <w:bCs/>
+                <w:sz w:val="28"/>
+                <w:szCs w:val="28"/>
+              </w:rPr>
+              <w:t>…{filingPartyN}</w:t>
+            </w:r>
+          </w:p>
+        </w:tc>
+      </w:tr>
+      <w:tr>
+        <w:tc>
+          <w:tcPr>
+            <w:tcW w:w="8520" w:type="dxa"/>
+            <w:gridSpan w:val="2"/>
+            <w:tcBorders>
+              <w:top w:val="nil"/>
+              <w:left w:val="nil"/>
+              <w:bottom w:val="nil"/>
+              <w:right w:val="nil"/>
+            </w:tcBorders>
+            <w:hideMark/>
+          </w:tcPr>
+          <w:p>
+            <w:pPr>
+              <w:spacing w:line="360" w:lineRule="auto"/>
+              <w:jc w:val="center"/>
+              <w:rPr>
+                <w:rFonts w:eastAsia="Bookman Old Style"/>
+                <w:sz w:val="28"/>
+                <w:szCs w:val="28"/>
+              </w:rPr>
+            </w:pPr>
+            <w:r>
+              <w:rPr>
+                <w:rFonts w:eastAsia="Bookman Old Style"/>
+                <w:sz w:val="28"/>
+                <w:szCs w:val="28"/>
+              </w:rPr>
+              <w:t>VERSUS</w:t>
+            </w:r>
+          </w:p>
+        </w:tc>
+      </w:tr>
+      <w:tr>
+        <w:tc>
+          <w:tcPr>
+            <w:tcW w:w="4616" w:type="dxa"/>
+            <w:tcBorders>
+              <w:top w:val="nil"/>
+              <w:left w:val="nil"/>
+              <w:bottom w:val="nil"/>
+              <w:right w:val="nil"/>
+            </w:tcBorders>
+            <w:hideMark/>
+          </w:tcPr>
+          <w:p>
+            <w:pPr>
+              <w:spacing w:line="360" w:lineRule="auto"/>
+              <w:rPr>
+                <w:rFonts w:eastAsia="Bookman Old Style"/>
+                <w:sz w:val="28"/>
+                <w:szCs w:val="28"/>
+              </w:rPr>
+            </w:pPr>
+            <w:r>
+              <w:rPr>
+                <w:rFonts w:eastAsia="Bookman Old Style"/>
+                <w:sz w:val="28"/>
+                <w:szCs w:val="28"/>
+              </w:rPr>
+              <w:t>{respondentWS}</w:t>
+            </w:r>
+          </w:p>
+        </w:tc>
+        <w:tc>
+          <w:tcPr>
+            <w:tcW w:w="3904" w:type="dxa"/>
+            <w:tcBorders>
+              <w:top w:val="nil"/>
+              <w:left w:val="nil"/>
+              <w:bottom w:val="nil"/>
+              <w:right w:val="nil"/>
+            </w:tcBorders>
+            <w:hideMark/>
+          </w:tcPr>
+          <w:p>
+            <w:pPr>
+              <w:spacing w:line="360" w:lineRule="auto"/>
+              <w:ind w:right="-127"/>
+              <w:jc w:val="right"/>
+              <w:outlineLvl w:val="0"/>
+              <w:rPr>
+                <w:b/>
+                <w:sz w:val="28"/>
+                <w:szCs w:val="28"/>
+              </w:rPr>
+            </w:pPr>
+            <w:r>
+              <w:rPr>
+                <w:bCs/>
+                <w:sz w:val="28"/>
+                <w:szCs w:val="28"/>
+              </w:rPr>
+              <w:t>…{oppositePartyN}</w:t>
+            </w:r>
+          </w:p>
+        </w:tc>
+      </w:tr>
+      <w:tr>
+        <w:tc>
+          <w:tcPr>
+            <w:tcW w:w="4616" w:type="dxa"/>
+            <w:tcBorders>
+              <w:top w:val="nil"/>
+              <w:left w:val="nil"/>
+              <w:bottom w:val="nil"/>
+              <w:right w:val="nil"/>
+            </w:tcBorders>
+            <w:hideMark/>
+          </w:tcPr>
+          <w:p>
+            <w:pPr>
+              <w:spacing w:line="360" w:lineRule="auto"/>
+              <w:rPr>
+                <w:rFonts w:eastAsia="Bookman Old Style"/>
+                <w:sz w:val="28"/>
+                <w:szCs w:val="28"/>
+              </w:rPr>
+            </w:pPr>
+          </w:p>
+          <w:p>
+            <w:pPr>
+              <w:spacing w:line="360" w:lineRule="auto"/>
+              <w:rPr>
+                <w:rFonts w:eastAsia="Bookman Old Style"/>
+                <w:sz w:val="28"/>
+                <w:szCs w:val="28"/>
+              </w:rPr>
+            </w:pPr>
+          </w:p>
+        </w:tc>
+        <w:tc>
+          <w:tcPr>
+            <w:tcW w:w="3904" w:type="dxa"/>
+            <w:tcBorders>
+              <w:top w:val="nil"/>
+              <w:left w:val="nil"/>
+              <w:bottom w:val="nil"/>
+              <w:right w:val="nil"/>
+            </w:tcBorders>
+            <w:hideMark/>
+          </w:tcPr>
+          <w:p>
+            <w:pPr>
+              <w:spacing w:line="360" w:lineRule="auto"/>
+              <w:jc w:val="right"/>
+              <w:outlineLvl w:val="0"/>
+              <w:rPr>
+                <w:bCs/>
+                <w:sz w:val="28"/>
+                <w:szCs w:val="28"/>
+              </w:rPr>
+            </w:pPr>
+          </w:p>
+        </w:tc>
+      </w:tr>
+      <w:tr>
+        <w:tc>
+          <w:tcPr>
+            <w:tcW w:w="4616" w:type="dxa"/>
+            <w:tcBorders>
+              <w:top w:val="nil"/>
+              <w:left w:val="nil"/>
+              <w:bottom w:val="nil"/>
+              <w:right w:val="nil"/>
+            </w:tcBorders>
+            <w:hideMark/>
+          </w:tcPr>
+          <w:p>
+            <w:pPr>
+              <w:spacing w:line="360" w:lineRule="auto"/>
+              <w:rPr>
+                <w:rFonts w:eastAsia="Bookman Old Style"/>
+                <w:sz w:val="28"/>
+                <w:szCs w:val="28"/>
+              </w:rPr>
+            </w:pPr>
+          </w:p>
+        </w:tc>
+        <w:tc>
+          <w:tcPr>
+            <w:tcW w:w="3904" w:type="dxa"/>
+            <w:tcBorders>
+              <w:top w:val="nil"/>
+              <w:left w:val="nil"/>
+              <w:bottom w:val="nil"/>
+              <w:right w:val="nil"/>
+            </w:tcBorders>
+            <w:hideMark/>
+          </w:tcPr>
+          <w:p>
+            <w:pPr>
+              <w:spacing w:line="360" w:lineRule="auto"/>
+              <w:jc w:val="right"/>
+              <w:outlineLvl w:val="0"/>
+              <w:rPr>
+                <w:bCs/>
+                <w:sz w:val="28"/>
+                <w:szCs w:val="28"/>
+              </w:rPr>
+            </w:pPr>
+          </w:p>
+        </w:tc>
+      </w:tr>
+    </w:tbl>
+    <w:p>
+      <w:pPr>
+        <w:spacing w:line="360" w:lineRule="auto"/>
+        <w:jc w:val="both"/>
+        <w:outlineLvl w:val="0"/>
+        <w:rPr>
+          <w:bCs/>
+          <w:sz w:val="28"/>
+          <w:szCs w:val="28"/>
+        </w:rPr>
+      </w:pPr>
+      <w:r>
+        <w:rPr>
+          <w:bCs/>
+          <w:sz w:val="28"/>
+          <w:szCs w:val="28"/>
+        </w:rPr>
+        <w:t>I, {nameOfSignatory} {nameOfParentOfSignatory}, aged about {ageOfSignatory}, being the {designationOfSignatory}, having {signatoryLocation} at {addressOfSignatory}, do hereby solemnly state and affirm on oath as under:</w:t>
+      </w:r>
+    </w:p>
+    <w:p>
+      <w:pPr>
+        <w:spacing w:line="360" w:lineRule="auto"/>
+        <w:jc w:val="both"/>
+        <w:outlineLvl w:val="0"/>
+        <w:rPr>
+          <w:bCs/>
+          <w:sz w:val="28"/>
+          <w:szCs w:val="28"/>
+        </w:rPr>
+      </w:pPr>
+      <w:r>
+        <w:rPr>
+          <w:bCs/>
+          <w:sz w:val="28"/>
+          <w:szCs w:val="28"/>
+        </w:rPr>
+        <w:t>1)</w:t>
+      </w:r>
+      <w:r>
+        <w:rPr>
+          <w:bCs/>
+          <w:sz w:val="28"/>
+          <w:szCs w:val="28"/>
+        </w:rPr>
+        <w:tab/>
+        <w:t>That I am the {DESIGNATION OF THE SIGNATORY} in the captioned {docType} and as such I am conversant with the facts and circumstances of the present case and competent to swear the present affidavit.</w:t>
+      </w:r>
+    </w:p>
+    <w:p>
+      <w:pPr>
+        <w:spacing w:line="360" w:lineRule="auto"/>
+        <w:jc w:val="both"/>
+        <w:outlineLvl w:val="0"/>
+        <w:rPr>
+          <w:bCs/>
+          <w:sz w:val="28"/>
+          <w:szCs w:val="28"/>
+        </w:rPr>
+      </w:pPr>
+      <w:r>
+        <w:rPr>
+          <w:bCs/>
+          <w:sz w:val="28"/>
+          <w:szCs w:val="28"/>
+        </w:rPr>
+        <w:t>2)</w:t>
+      </w:r>
+      <w:r>
+        <w:rPr>
+          <w:bCs/>
+          <w:sz w:val="28"/>
+          <w:szCs w:val="28"/>
+        </w:rPr>
+        <w:tab/>
+        <w:t>That the accompanying {docType} has been drafted by my counsel under my instructions and contents of the same are not being repeated herein for the sake of brevity. The contents of the same are true and correct to the best of my knowledge and belief.</w:t>
+      </w:r>
+    </w:p>
+    <w:p>
+      <w:pPr>
+        <w:spacing w:line="360" w:lineRule="auto"/>
+        <w:jc w:val="both"/>
+        <w:outlineLvl w:val="0"/>
+        <w:rPr>
+          <w:bCs/>
+          <w:sz w:val="28"/>
+          <w:szCs w:val="28"/>
+        </w:rPr>
+      </w:pPr>
+      <w:r>
+        <w:rPr>
+          <w:bCs/>
+          <w:sz w:val="28"/>
+          <w:szCs w:val="28"/>
+        </w:rPr>
+        <w:t>3)</w:t>
+      </w:r>
+      <w:r>
+        <w:rPr>
+          <w:bCs/>
+          <w:sz w:val="28"/>
+          <w:szCs w:val="28"/>
+        </w:rPr>
+        <w:tab/>
+        <w:t>Nothing false is contained therein and nothing material has been concealed therefrom.</w:t>
+      </w:r>
+    </w:p>
+    <w:p>
+      <w:pPr>
+        <w:spacing w:line="360" w:lineRule="auto"/>
+        <w:jc w:val="both"/>
+        <w:outlineLvl w:val="0"/>
+        <w:rPr>
+          <w:bCs/>
+          <w:sz w:val="28"/>
+          <w:szCs w:val="28"/>
+        </w:rPr>
+      </w:pPr>
+      <w:r>
+        <w:rPr>
+          <w:bCs/>
+          <w:sz w:val="28"/>
+          <w:szCs w:val="28"/>
+        </w:rPr>
+        <w:t>4)</w:t>
+      </w:r>
+      <w:r>
+        <w:rPr>
+          <w:bCs/>
+          <w:sz w:val="28"/>
+          <w:szCs w:val="28"/>
+        </w:rPr>
+        <w:tab/>
+        <w:t>The documents annexed with this {docType} are true copies of the original.</w:t>
+      </w:r>
+    </w:p>
+    <w:p>
+      <w:pPr>
+        <w:spacing w:before="240" w:line="360" w:lineRule="auto"/>
+        <w:jc w:val="right"/>
+        <w:rPr>
+          <w:b/>
+          <w:sz w:val="28"/>
+          <w:szCs w:val="28"/>
+        </w:rPr>
+      </w:pPr>
+      <w:r>
+        <w:rPr>
+          <w:b/>
+          <w:sz w:val="28"/>
+          <w:szCs w:val="28"/>
+        </w:rPr>
+        <w:t>DEPONENT</w:t>
+      </w:r>
+    </w:p>
+    <w:p>
+      <w:pPr>
+        <w:spacing w:line="360" w:lineRule="auto"/>
+        <w:rPr>
+          <w:b/>
+          <w:sz w:val="28"/>
+          <w:szCs w:val="28"/>
+          <w:u w:val="single"/>
+        </w:rPr>
+      </w:pPr>
+      <w:r>
+        <w:rPr>
+          <w:b/>
+          <w:sz w:val="28"/>
+          <w:szCs w:val="28"/>
+          <w:u w:val="single"/>
+        </w:rPr>
+        <w:t>VERIFICATION</w:t>
+      </w:r>
+    </w:p>
+    <w:p>
+      <w:pPr>
+        <w:spacing w:line="360" w:lineRule="auto"/>
+        <w:jc w:val="both"/>
+        <w:rPr>
+          <w:sz w:val="28"/>
+          <w:szCs w:val="28"/>
+        </w:rPr>
+      </w:pPr>
+      <w:r>
+        <w:rPr>
+          <w:sz w:val="28"/>
+          <w:szCs w:val="28"/>
+        </w:rPr>
+        <w:lastRenderedPageBreak/>
+        <w:t xml:space="preserve">Verified on this </w:t>
+      </w:r>
+      <w:r>
+        <w:rPr>
+          <w:color w:val="000000"/>
+          <w:sz w:val="28"/>
+          <w:szCs w:val="28"/>
+          <w:lang w:val="en-US" w:eastAsia="zh-CN" w:bidi="ar-SA"/>
+        </w:rPr>
+        <w:t xml:space="preserve">{dayOfFiling} day of {monthOfFiling}, {yearOfFiling} </w:t>
+      </w:r>
+      <w:r>
+        <w:rPr>
+          <w:sz w:val="28"/>
+          <w:szCs w:val="28"/>
+        </w:rPr>
+        <w:t xml:space="preserve">at </w:t>
+      </w:r>
+      <w:r>
+        <w:rPr>
+          <w:color w:val="000000"/>
+          <w:sz w:val="28"/>
+          <w:szCs w:val="28"/>
+          <w:lang w:val="en-US" w:eastAsia="zh-CN" w:bidi="ar-SA"/>
+        </w:rPr>
+        <w:t>{placeOfFiling}</w:t>
+      </w:r>
+      <w:r>
+        <w:rPr>
+          <w:sz w:val="28"/>
+          <w:szCs w:val="28"/>
+        </w:rPr>
+        <w:t xml:space="preserve"> that the contents of this affidavit are true and correct to the best of my knowledge and nothing material has been concealed therefrom.</w:t>
+      </w:r>
+    </w:p>
+    <w:p>
+      <w:pPr>
+        <w:spacing w:line="360" w:lineRule="auto"/>
+        <w:jc w:val="both"/>
+        <w:rPr>
+          <w:sz w:val="28"/>
+          <w:szCs w:val="28"/>
+        </w:rPr>
+      </w:pPr>
+    </w:p>
+    <w:p>
+      <w:pPr>
+        <w:spacing w:line="360" w:lineRule="auto"/>
+        <w:jc w:val="right"/>
+        <w:outlineLvl w:val="0"/>
+        <w:rPr>
+          <w:sz w:val="28"/>
+          <w:szCs w:val="28"/>
+        </w:rPr>
+      </w:pPr>
+      <w:r>
+        <w:rPr>
+          <w:b/>
+          <w:sz w:val="28"/>
+          <w:szCs w:val="28"/>
+        </w:rPr>
+        <w:t>DEPONENT</w:t>
+      </w:r>
+    </w:p>
+    <w:p/>
     <w:sectPr>
       <w:pgSz w:w="11906" w:h="16838"/>
       <w:pgMar w:top="1440" w:right="1440" w:bottom="1440" w:left="1440" w:header="708" w:footer="708" w:gutter="0"/>
@@ -491,6 +1098,16 @@
   <w:style w:type="paragraph" w:default="1" w:styleId="Normal">
     <w:name w:val="Normal"/>
     <w:qFormat/>
+    <w:rsid w:val="00644814"/>
+    <w:pPr>
+      <w:spacing w:after="0" w:line="240" w:lineRule="auto"/>
+    </w:pPr>
+    <w:rPr>
+      <w:rFonts w:ascii="Times New Roman" w:eastAsia="Times New Roman" w:hAnsi="Times New Roman" w:cs="Times New Roman"/>
+      <w:kern w:val="0"/>
+      <w:lang w:eastAsia="en-GB" w:bidi="hi-IN"/>
+      <w14:ligatures w14:val="none"/>
+    </w:rPr>
   </w:style>
   <w:style w:type="paragraph" w:styleId="Heading1">
     <w:name w:val="heading 1"/>
@@ -503,14 +1120,17 @@
     <w:pPr>
       <w:keepNext/>
       <w:keepLines/>
-      <w:spacing w:before="360" w:after="80"/>
+      <w:spacing w:before="360" w:after="80" w:line="278" w:lineRule="auto"/>
       <w:outlineLvl w:val="0"/>
     </w:pPr>
     <w:rPr>
       <w:rFonts w:asciiTheme="majorHAnsi" w:eastAsiaTheme="majorEastAsia" w:hAnsiTheme="majorHAnsi" w:cstheme="majorBidi"/>
       <w:color w:val="2F5496" w:themeColor="accent1" w:themeShade="BF"/>
+      <w:kern w:val="2"/>
       <w:sz w:val="40"/>
       <w:szCs w:val="40"/>
+      <w:lang w:eastAsia="en-US" w:bidi="ar-SA"/>
+      <w14:ligatures w14:val="standardContextual"/>
     </w:rPr>
   </w:style>
   <w:style w:type="paragraph" w:styleId="Heading2">
@@ -526,14 +1146,17 @@
     <w:pPr>
       <w:keepNext/>
       <w:keepLines/>
-      <w:spacing w:before="160" w:after="80"/>
+      <w:spacing w:before="160" w:after="80" w:line="278" w:lineRule="auto"/>
       <w:outlineLvl w:val="1"/>
     </w:pPr>
     <w:rPr>
       <w:rFonts w:asciiTheme="majorHAnsi" w:eastAsiaTheme="majorEastAsia" w:hAnsiTheme="majorHAnsi" w:cstheme="majorBidi"/>
       <w:color w:val="2F5496" w:themeColor="accent1" w:themeShade="BF"/>
+      <w:kern w:val="2"/>
       <w:sz w:val="32"/>
       <w:szCs w:val="32"/>
+      <w:lang w:eastAsia="en-US" w:bidi="ar-SA"/>
+      <w14:ligatures w14:val="standardContextual"/>
     </w:rPr>
   </w:style>
   <w:style w:type="paragraph" w:styleId="Heading3">
@@ -549,14 +1172,17 @@
     <w:pPr>
       <w:keepNext/>
       <w:keepLines/>
-      <w:spacing w:before="160" w:after="80"/>
+      <w:spacing w:before="160" w:after="80" w:line="278" w:lineRule="auto"/>
       <w:outlineLvl w:val="2"/>
     </w:pPr>
     <w:rPr>
-      <w:rFonts w:eastAsiaTheme="majorEastAsia" w:cstheme="majorBidi"/>
+      <w:rFonts w:asciiTheme="minorHAnsi" w:eastAsiaTheme="majorEastAsia" w:hAnsiTheme="minorHAnsi" w:cstheme="majorBidi"/>
       <w:color w:val="2F5496" w:themeColor="accent1" w:themeShade="BF"/>
+      <w:kern w:val="2"/>
       <w:sz w:val="28"/>
       <w:szCs w:val="28"/>
+      <w:lang w:eastAsia="en-US" w:bidi="ar-SA"/>
+      <w14:ligatures w14:val="standardContextual"/>
     </w:rPr>
   </w:style>
   <w:style w:type="paragraph" w:styleId="Heading4">
@@ -572,14 +1198,17 @@
     <w:pPr>
       <w:keepNext/>
       <w:keepLines/>
-      <w:spacing w:before="80" w:after="40"/>
+      <w:spacing w:before="80" w:after="40" w:line="278" w:lineRule="auto"/>
       <w:outlineLvl w:val="3"/>
     </w:pPr>
     <w:rPr>
-      <w:rFonts w:eastAsiaTheme="majorEastAsia" w:cstheme="majorBidi"/>
+      <w:rFonts w:asciiTheme="minorHAnsi" w:eastAsiaTheme="majorEastAsia" w:hAnsiTheme="minorHAnsi" w:cstheme="majorBidi"/>
       <w:i/>
       <w:iCs/>
       <w:color w:val="2F5496" w:themeColor="accent1" w:themeShade="BF"/>
+      <w:kern w:val="2"/>
+      <w:lang w:eastAsia="en-US" w:bidi="ar-SA"/>
+      <w14:ligatures w14:val="standardContextual"/>
     </w:rPr>
   </w:style>
   <w:style w:type="paragraph" w:styleId="Heading5">
@@ -595,12 +1224,15 @@
     <w:pPr>
       <w:keepNext/>
       <w:keepLines/>
-      <w:spacing w:before="80" w:after="40"/>
+      <w:spacing w:before="80" w:after="40" w:line="278" w:lineRule="auto"/>
       <w:outlineLvl w:val="4"/>
     </w:pPr>
     <w:rPr>
-      <w:rFonts w:eastAsiaTheme="majorEastAsia" w:cstheme="majorBidi"/>
+      <w:rFonts w:asciiTheme="minorHAnsi" w:eastAsiaTheme="majorEastAsia" w:hAnsiTheme="minorHAnsi" w:cstheme="majorBidi"/>
       <w:color w:val="2F5496" w:themeColor="accent1" w:themeShade="BF"/>
+      <w:kern w:val="2"/>
+      <w:lang w:eastAsia="en-US" w:bidi="ar-SA"/>
+      <w14:ligatures w14:val="standardContextual"/>
     </w:rPr>
   </w:style>
   <w:style w:type="paragraph" w:styleId="Heading6">
@@ -616,14 +1248,17 @@
     <w:pPr>
       <w:keepNext/>
       <w:keepLines/>
-      <w:spacing w:before="40" w:after="0"/>
+      <w:spacing w:before="40" w:line="278" w:lineRule="auto"/>
       <w:outlineLvl w:val="5"/>
     </w:pPr>
     <w:rPr>
-      <w:rFonts w:eastAsiaTheme="majorEastAsia" w:cstheme="majorBidi"/>
+      <w:rFonts w:asciiTheme="minorHAnsi" w:eastAsiaTheme="majorEastAsia" w:hAnsiTheme="minorHAnsi" w:cstheme="majorBidi"/>
       <w:i/>
       <w:iCs/>
       <w:color w:val="595959" w:themeColor="text1" w:themeTint="A6"/>
+      <w:kern w:val="2"/>
+      <w:lang w:eastAsia="en-US" w:bidi="ar-SA"/>
+      <w14:ligatures w14:val="standardContextual"/>
     </w:rPr>
   </w:style>
   <w:style w:type="paragraph" w:styleId="Heading7">
@@ -639,12 +1274,15 @@
     <w:pPr>
       <w:keepNext/>
       <w:keepLines/>
-      <w:spacing w:before="40" w:after="0"/>
+      <w:spacing w:before="40" w:line="278" w:lineRule="auto"/>
       <w:outlineLvl w:val="6"/>
     </w:pPr>
     <w:rPr>
-      <w:rFonts w:eastAsiaTheme="majorEastAsia" w:cstheme="majorBidi"/>
+      <w:rFonts w:asciiTheme="minorHAnsi" w:eastAsiaTheme="majorEastAsia" w:hAnsiTheme="minorHAnsi" w:cstheme="majorBidi"/>
       <w:color w:val="595959" w:themeColor="text1" w:themeTint="A6"/>
+      <w:kern w:val="2"/>
+      <w:lang w:eastAsia="en-US" w:bidi="ar-SA"/>
+      <w14:ligatures w14:val="standardContextual"/>
     </w:rPr>
   </w:style>
   <w:style w:type="paragraph" w:styleId="Heading8">
@@ -660,14 +1298,17 @@
     <w:pPr>
       <w:keepNext/>
       <w:keepLines/>
-      <w:spacing w:after="0"/>
+      <w:spacing w:line="278" w:lineRule="auto"/>
       <w:outlineLvl w:val="7"/>
     </w:pPr>
     <w:rPr>
-      <w:rFonts w:eastAsiaTheme="majorEastAsia" w:cstheme="majorBidi"/>
+      <w:rFonts w:asciiTheme="minorHAnsi" w:eastAsiaTheme="majorEastAsia" w:hAnsiTheme="minorHAnsi" w:cstheme="majorBidi"/>
       <w:i/>
       <w:iCs/>
       <w:color w:val="272727" w:themeColor="text1" w:themeTint="D8"/>
+      <w:kern w:val="2"/>
+      <w:lang w:eastAsia="en-US" w:bidi="ar-SA"/>
+      <w14:ligatures w14:val="standardContextual"/>
     </w:rPr>
   </w:style>
   <w:style w:type="paragraph" w:styleId="Heading9">
@@ -683,12 +1324,15 @@
     <w:pPr>
       <w:keepNext/>
       <w:keepLines/>
-      <w:spacing w:after="0"/>
+      <w:spacing w:line="278" w:lineRule="auto"/>
       <w:outlineLvl w:val="8"/>
     </w:pPr>
     <w:rPr>
-      <w:rFonts w:eastAsiaTheme="majorEastAsia" w:cstheme="majorBidi"/>
+      <w:rFonts w:asciiTheme="minorHAnsi" w:eastAsiaTheme="majorEastAsia" w:hAnsiTheme="minorHAnsi" w:cstheme="majorBidi"/>
       <w:color w:val="272727" w:themeColor="text1" w:themeTint="D8"/>
+      <w:kern w:val="2"/>
+      <w:lang w:eastAsia="en-US" w:bidi="ar-SA"/>
+      <w14:ligatures w14:val="standardContextual"/>
     </w:rPr>
   </w:style>
   <w:style w:type="character" w:default="1" w:styleId="DefaultParagraphFont">
@@ -846,7 +1490,7 @@
     <w:qFormat/>
     <w:rsid w:val="00EF3057"/>
     <w:pPr>
-      <w:spacing w:after="80" w:line="240" w:lineRule="auto"/>
+      <w:spacing w:after="80"/>
       <w:contextualSpacing/>
     </w:pPr>
     <w:rPr>
@@ -855,6 +1499,8 @@
       <w:kern w:val="28"/>
       <w:sz w:val="56"/>
       <w:szCs w:val="56"/>
+      <w:lang w:eastAsia="en-US" w:bidi="ar-SA"/>
+      <w14:ligatures w14:val="standardContextual"/>
     </w:rPr>
   </w:style>
   <w:style w:type="character" w:customStyle="1" w:styleId="TitleChar">
@@ -883,13 +1529,17 @@
       <w:numPr>
         <w:ilvl w:val="1"/>
       </w:numPr>
+      <w:spacing w:after="160" w:line="278" w:lineRule="auto"/>
     </w:pPr>
     <w:rPr>
-      <w:rFonts w:eastAsiaTheme="majorEastAsia" w:cstheme="majorBidi"/>
+      <w:rFonts w:asciiTheme="minorHAnsi" w:eastAsiaTheme="majorEastAsia" w:hAnsiTheme="minorHAnsi" w:cstheme="majorBidi"/>
       <w:color w:val="595959" w:themeColor="text1" w:themeTint="A6"/>
       <w:spacing w:val="15"/>
+      <w:kern w:val="2"/>
       <w:sz w:val="28"/>
       <w:szCs w:val="28"/>
+      <w:lang w:eastAsia="en-US" w:bidi="ar-SA"/>
+      <w14:ligatures w14:val="standardContextual"/>
     </w:rPr>
   </w:style>
   <w:style w:type="character" w:customStyle="1" w:styleId="SubtitleChar">
@@ -915,13 +1565,17 @@
     <w:qFormat/>
     <w:rsid w:val="00EF3057"/>
     <w:pPr>
-      <w:spacing w:before="160"/>
+      <w:spacing w:before="160" w:after="160" w:line="278" w:lineRule="auto"/>
       <w:jc w:val="center"/>
     </w:pPr>
     <w:rPr>
+      <w:rFonts w:asciiTheme="minorHAnsi" w:eastAsiaTheme="minorHAnsi" w:hAnsiTheme="minorHAnsi" w:cstheme="minorBidi"/>
       <w:i/>
       <w:iCs/>
       <w:color w:val="404040" w:themeColor="text1" w:themeTint="BF"/>
+      <w:kern w:val="2"/>
+      <w:lang w:eastAsia="en-US" w:bidi="ar-SA"/>
+      <w14:ligatures w14:val="standardContextual"/>
     </w:rPr>
   </w:style>
   <w:style w:type="character" w:customStyle="1" w:styleId="QuoteChar">
@@ -943,9 +1597,16 @@
     <w:qFormat/>
     <w:rsid w:val="00EF3057"/>
     <w:pPr>
+      <w:spacing w:after="160" w:line="278" w:lineRule="auto"/>
       <w:ind w:left="720"/>
       <w:contextualSpacing/>
     </w:pPr>
+    <w:rPr>
+      <w:rFonts w:asciiTheme="minorHAnsi" w:eastAsiaTheme="minorHAnsi" w:hAnsiTheme="minorHAnsi" w:cstheme="minorBidi"/>
+      <w:kern w:val="2"/>
+      <w:lang w:eastAsia="en-US" w:bidi="ar-SA"/>
+      <w14:ligatures w14:val="standardContextual"/>
+    </w:rPr>
   </w:style>
   <w:style w:type="character" w:styleId="IntenseEmphasis">
     <w:name w:val="Intense Emphasis"/>
@@ -972,14 +1633,18 @@
         <w:top w:val="single" w:sz="4" w:space="10" w:color="2F5496" w:themeColor="accent1" w:themeShade="BF"/>
         <w:bottom w:val="single" w:sz="4" w:space="10" w:color="2F5496" w:themeColor="accent1" w:themeShade="BF"/>
       </w:pBdr>
-      <w:spacing w:before="360" w:after="360"/>
+      <w:spacing w:before="360" w:after="360" w:line="278" w:lineRule="auto"/>
       <w:ind w:left="864" w:right="864"/>
       <w:jc w:val="center"/>
     </w:pPr>
     <w:rPr>
+      <w:rFonts w:asciiTheme="minorHAnsi" w:eastAsiaTheme="minorHAnsi" w:hAnsiTheme="minorHAnsi" w:cstheme="minorBidi"/>
       <w:i/>
       <w:iCs/>
       <w:color w:val="2F5496" w:themeColor="accent1" w:themeShade="BF"/>
+      <w:kern w:val="2"/>
+      <w:lang w:eastAsia="en-US" w:bidi="ar-SA"/>
+      <w14:ligatures w14:val="standardContextual"/>
     </w:rPr>
   </w:style>
   <w:style w:type="character" w:customStyle="1" w:styleId="IntenseQuoteChar">

</xml_diff>

<commit_message>
Updated document with readable diff document changes
</commit_message>
<xml_diff>
--- a/test.docx
+++ b/test.docx
@@ -685,6 +685,14 @@
           <w:szCs w:val="28"/>
         </w:rPr>
         <w:t>DEPONENT</w:t>
+      </w:r>
+      <w:r>
+        <w:rPr>
+          <w:b/>
+          <w:sz w:val="28"/>
+          <w:szCs w:val="28"/>
+        </w:rPr>
+        <w:t xml:space="preserve"> SIGN</w:t>
       </w:r>
     </w:p>
     <w:p/>

</xml_diff>